<commit_message>
Complete PRD v10 phases 2-5 and deployment readiness
</commit_message>
<xml_diff>
--- a/docs/prd/ZITO_PRD_v10_ULTIMATE.docx
+++ b/docs/prd/ZITO_PRD_v10_ULTIMATE.docx
@@ -104,47 +104,15 @@
         <w:jc w:val="center"/>
       </w:pPr>
       <w:r>
-        <w:rPr>
-          <w:color w:val="5A6A7A"/>
-          <w:sz w:val="16"/>
-          <w:szCs w:val="16"/>
-        </w:rPr>
-        <w:t>© 2024 ZITO Logistics Technologies. All Rights Reserved.</w:t>
-      </w:r>
-      <w:r>
-        <w:br w:type="page"/>
-      </w:r>
-      <w:r>
-        <w:rPr>
-          <w:b/>
-          <w:bCs/>
-          <w:color w:val="1A3C5E"/>
-          <w:sz w:val="32"/>
-          <w:szCs w:val="32"/>
-        </w:rPr>
-        <w:lastRenderedPageBreak/>
-        <w:t xml:space="preserve">1. </w:t>
-      </w:r>
-      <w:r>
-        <w:rPr>
-          <w:rFonts w:ascii="Segoe UI Emoji" w:hAnsi="Segoe UI Emoji" w:cs="Segoe UI Emoji"/>
-          <w:b/>
-          <w:bCs/>
-          <w:color w:val="1A3C5E"/>
-          <w:sz w:val="32"/>
-          <w:szCs w:val="32"/>
-        </w:rPr>
-        <w:t>🎯</w:t>
-      </w:r>
-      <w:r>
-        <w:rPr>
-          <w:b/>
-          <w:bCs/>
-          <w:color w:val="1A3C5E"/>
-          <w:sz w:val="32"/>
-          <w:szCs w:val="32"/>
-        </w:rPr>
-        <w:t xml:space="preserve"> Product Vision</w:t>
+        <w:t>? 2024 ZITO Logistics Technologies. All Rights Reserved.</w:t>
+      </w:r>
+    </w:p>
+    <w:p>
+      <w:pPr>
+        <w:pStyle w:val="Heading1"/>
+      </w:pPr>
+      <w:r>
+        <w:t>1. Product Vision</w:t>
       </w:r>
     </w:p>
     <w:p>
@@ -3376,36 +3344,11 @@
       </w:pPr>
     </w:p>
     <w:p>
-      <w:r>
-        <w:rPr>
-          <w:b/>
-          <w:bCs/>
-          <w:color w:val="1A3C5E"/>
-          <w:sz w:val="32"/>
-          <w:szCs w:val="32"/>
-        </w:rPr>
-        <w:t xml:space="preserve">10. </w:t>
-      </w:r>
-      <w:r>
-        <w:rPr>
-          <w:rFonts w:ascii="Segoe UI Emoji" w:hAnsi="Segoe UI Emoji" w:cs="Segoe UI Emoji"/>
-          <w:b/>
-          <w:bCs/>
-          <w:color w:val="1A3C5E"/>
-          <w:sz w:val="32"/>
-          <w:szCs w:val="32"/>
-        </w:rPr>
-        <w:t>🏬</w:t>
-      </w:r>
-      <w:r>
-        <w:rPr>
-          <w:b/>
-          <w:bCs/>
-          <w:color w:val="1A3C5E"/>
-          <w:sz w:val="32"/>
-          <w:szCs w:val="32"/>
-        </w:rPr>
-        <w:t xml:space="preserve"> Warehouse System</w:t>
+      <w:pPr>
+        <w:pStyle w:val="Heading1"/>
+      </w:pPr>
+      <w:r>
+        <w:t>10. Warehouse System</w:t>
       </w:r>
     </w:p>
     <w:p>
@@ -9416,11 +9359,123 @@
     </w:tbl>
     <w:p>
       <w:pPr>
-        <w:pBdr>
-          <w:bottom w:val="single" w:sz="4" w:space="1" w:color="C9D8E8"/>
-        </w:pBdr>
-        <w:spacing w:after="120"/>
-      </w:pPr>
+        <w:pStyle w:val="Heading3"/>
+      </w:pPr>
+      <w:r>
+        <w:t>Operational Analytics</w:t>
+      </w:r>
+    </w:p>
+    <w:p>
+      <w:pPr>
+        <w:pStyle w:val="ListParagraph"/>
+      </w:pPr>
+      <w:r>
+        <w:t>Booking funnel conversion and service-wise order volumes</w:t>
+      </w:r>
+    </w:p>
+    <w:p>
+      <w:pPr>
+        <w:pStyle w:val="ListParagraph"/>
+      </w:pPr>
+      <w:r>
+        <w:t>On-time pickup, on-time delivery, failed delivery, and cancellation rates</w:t>
+      </w:r>
+    </w:p>
+    <w:p>
+      <w:pPr>
+        <w:pStyle w:val="ListParagraph"/>
+      </w:pPr>
+      <w:r>
+        <w:t>Scan compliance, parcel aging, exception counts, and warehouse occupancy</w:t>
+      </w:r>
+    </w:p>
+    <w:p>
+      <w:pPr>
+        <w:pStyle w:val="Heading3"/>
+      </w:pPr>
+      <w:r>
+        <w:t>Commercial Analytics</w:t>
+      </w:r>
+    </w:p>
+    <w:p>
+      <w:pPr>
+        <w:pStyle w:val="ListParagraph"/>
+      </w:pPr>
+      <w:r>
+        <w:t>Gross merchandise value, net revenue, refunds, and branch profitability</w:t>
+      </w:r>
+    </w:p>
+    <w:p>
+      <w:pPr>
+        <w:pStyle w:val="ListParagraph"/>
+      </w:pPr>
+      <w:r>
+        <w:t>Receivables aging, payout aging, and collection efficiency by customer and agency</w:t>
+      </w:r>
+    </w:p>
+    <w:p>
+      <w:pPr>
+        <w:pStyle w:val="ListParagraph"/>
+      </w:pPr>
+      <w:r>
+        <w:t>Invoice, payment, and wallet movement summaries with reconciliation views</w:t>
+      </w:r>
+    </w:p>
+    <w:p>
+      <w:pPr>
+        <w:pStyle w:val="Heading3"/>
+      </w:pPr>
+      <w:r>
+        <w:t>Supply Analytics</w:t>
+      </w:r>
+    </w:p>
+    <w:p>
+      <w:pPr>
+        <w:pStyle w:val="ListParagraph"/>
+      </w:pPr>
+      <w:r>
+        <w:t>Driver utilization, acceptance rate, idle time, and no-show rate</w:t>
+      </w:r>
+    </w:p>
+    <w:p>
+      <w:pPr>
+        <w:pStyle w:val="ListParagraph"/>
+      </w:pPr>
+      <w:r>
+        <w:t>Vehicle uptime, maintenance downtime, and capacity utilization</w:t>
+      </w:r>
+    </w:p>
+    <w:p>
+      <w:pPr>
+        <w:pStyle w:val="ListParagraph"/>
+      </w:pPr>
+      <w:r>
+        <w:t>Partner activation, retention, and performance scorecards</w:t>
+      </w:r>
+    </w:p>
+    <w:p>
+      <w:pPr>
+        <w:pStyle w:val="Heading3"/>
+      </w:pPr>
+      <w:r>
+        <w:t>Rules:</w:t>
+      </w:r>
+    </w:p>
+    <w:p>
+      <w:pPr>
+        <w:pStyle w:val="ListParagraph"/>
+      </w:pPr>
+      <w:r>
+        <w:t>All analytics must support filtering by date, service, agency, region, customer, transporter, and staff owner</w:t>
+      </w:r>
+    </w:p>
+    <w:p>
+      <w:pPr>
+        <w:pStyle w:val="ListParagraph"/>
+      </w:pPr>
+      <w:r>
+        <w:t>Exports and scheduled reports must be available for finance, operations, and management reviews</w:t>
+      </w:r>
     </w:p>
     <w:p>
       <w:pPr>
@@ -17917,36 +17972,11 @@
       </w:pPr>
     </w:p>
     <w:p>
-      <w:r>
-        <w:rPr>
-          <w:b/>
-          <w:bCs/>
-          <w:color w:val="1A3C5E"/>
-          <w:sz w:val="32"/>
-          <w:szCs w:val="32"/>
-        </w:rPr>
-        <w:t xml:space="preserve">43. </w:t>
-      </w:r>
-      <w:r>
-        <w:rPr>
-          <w:rFonts w:ascii="Segoe UI Emoji" w:hAnsi="Segoe UI Emoji" w:cs="Segoe UI Emoji"/>
-          <w:b/>
-          <w:bCs/>
-          <w:color w:val="1A3C5E"/>
-          <w:sz w:val="32"/>
-          <w:szCs w:val="32"/>
-        </w:rPr>
-        <w:t>🎯</w:t>
-      </w:r>
-      <w:r>
-        <w:rPr>
-          <w:b/>
-          <w:bCs/>
-          <w:color w:val="1A3C5E"/>
-          <w:sz w:val="32"/>
-          <w:szCs w:val="32"/>
-        </w:rPr>
-        <w:t xml:space="preserve"> Implementation Status &amp; Readiness</w:t>
+      <w:pPr>
+        <w:pStyle w:val="Heading1"/>
+      </w:pPr>
+      <w:r>
+        <w:t>43. Implementation Status &amp; Readiness</w:t>
       </w:r>
     </w:p>
     <w:tbl>
@@ -18930,59 +18960,142 @@
     </w:tbl>
     <w:p>
       <w:pPr>
-        <w:spacing w:after="80"/>
-      </w:pPr>
-    </w:p>
-    <w:p>
-      <w:pPr>
+        <w:pStyle w:val="Heading3"/>
+      </w:pPr>
+      <w:r>
+        <w:t>Readiness Levels</w:t>
+      </w:r>
+    </w:p>
+    <w:p>
+      <w:pPr>
+        <w:pStyle w:val="ListParagraph"/>
+      </w:pPr>
+      <w:r>
+        <w:t>Defined - business rule documented and owner assigned</w:t>
+      </w:r>
+    </w:p>
+    <w:p>
+      <w:pPr>
+        <w:pStyle w:val="ListParagraph"/>
+      </w:pPr>
+      <w:r>
+        <w:t>Designed - API, UI, data model, and event flow approved</w:t>
+      </w:r>
+    </w:p>
+    <w:p>
+      <w:pPr>
+        <w:pStyle w:val="ListParagraph"/>
+      </w:pPr>
+      <w:r>
+        <w:t>In Build - development started with linked test cases</w:t>
+      </w:r>
+    </w:p>
+    <w:p>
+      <w:pPr>
+        <w:pStyle w:val="ListParagraph"/>
+      </w:pPr>
+      <w:r>
+        <w:t>QA Ready - feature complete and integrated in staging</w:t>
+      </w:r>
+    </w:p>
+    <w:p>
+      <w:pPr>
+        <w:pStyle w:val="ListParagraph"/>
+      </w:pPr>
+      <w:r>
+        <w:t>UAT Ready - business users validated the end-to-end flow</w:t>
+      </w:r>
+    </w:p>
+    <w:p>
+      <w:pPr>
+        <w:pStyle w:val="ListParagraph"/>
+      </w:pPr>
+      <w:r>
+        <w:t>Live Ready - monitoring, training, rollback, and support handoff completed</w:t>
+      </w:r>
+    </w:p>
+    <w:p>
+      <w:pPr>
+        <w:pStyle w:val="Heading3"/>
+      </w:pPr>
+      <w:r>
+        <w:t>Mandatory Release Gates</w:t>
+      </w:r>
+    </w:p>
+    <w:p>
+      <w:pPr>
+        <w:pStyle w:val="ListParagraph"/>
+      </w:pPr>
+      <w:r>
+        <w:t>Business sign-off completed for rules, pricing, permissions, exceptions, and operational fallback</w:t>
+      </w:r>
+    </w:p>
+    <w:p>
+      <w:pPr>
+        <w:pStyle w:val="ListParagraph"/>
+      </w:pPr>
+      <w:r>
+        <w:t>Security, compliance, and audit requirements verified</w:t>
+      </w:r>
+    </w:p>
+    <w:p>
+      <w:pPr>
+        <w:pStyle w:val="ListParagraph"/>
+      </w:pPr>
+      <w:r>
+        <w:t>Operational dashboards, alerts, and reconciliation controls verified</w:t>
+      </w:r>
+    </w:p>
+    <w:p>
+      <w:pPr>
+        <w:pStyle w:val="ListParagraph"/>
+      </w:pPr>
+      <w:r>
+        <w:t>Runbooks, support SOPs, and rollback plans documented</w:t>
+      </w:r>
+    </w:p>
+    <w:p>
+      <w:pPr>
+        <w:pStyle w:val="Heading3"/>
+      </w:pPr>
+      <w:r>
+        <w:t>Definition of Completion</w:t>
+      </w:r>
+    </w:p>
+    <w:p>
+      <w:pPr>
+        <w:pStyle w:val="ListParagraph"/>
+      </w:pPr>
+      <w:r>
+        <w:t>A module is not complete until backend, web/admin, mobile/ops touchpoints, notifications, audit logs, reports, and exception handling are implemented where applicable</w:t>
+      </w:r>
+    </w:p>
+    <w:p>
+      <w:pPr>
+        <w:pStyle w:val="ListParagraph"/>
+      </w:pPr>
+      <w:r>
+        <w:t>Happy path, failure path, permission checks, and data validation must all pass before release</w:t>
+      </w:r>
+    </w:p>
+    <w:p>
+      <w:pPr>
+        <w:pStyle w:val="ListParagraph"/>
+      </w:pPr>
+      <w:r>
+        <w:t>Deferred items must be explicitly tagged to a later release and must not silently block launch scope</w:t>
+      </w:r>
+    </w:p>
+    <w:p>
+      <w:pPr>
+        <w:pStyle w:val="Heading1"/>
         <w:rPr>
           <w:b/>
           <w:bCs/>
         </w:rPr>
       </w:pPr>
       <w:r>
-        <w:rPr>
-          <w:b/>
-          <w:bCs/>
-          <w:color w:val="1A3C5E"/>
-          <w:sz w:val="32"/>
-          <w:szCs w:val="32"/>
-        </w:rPr>
-        <w:t>44</w:t>
-      </w:r>
-      <w:r>
-        <w:rPr>
-          <w:b/>
-          <w:bCs/>
-        </w:rPr>
-        <w:t xml:space="preserve">. </w:t>
-      </w:r>
-      <w:r>
-        <w:rPr>
-          <w:b/>
-          <w:bCs/>
-          <w:color w:val="1A3C5E"/>
-          <w:sz w:val="32"/>
-          <w:szCs w:val="32"/>
-        </w:rPr>
-        <w:t>ADVANCED</w:t>
-      </w:r>
-      <w:r>
-        <w:rPr>
-          <w:b/>
-          <w:bCs/>
-        </w:rPr>
-        <w:t xml:space="preserve"> </w:t>
-      </w:r>
-      <w:r>
-        <w:rPr>
-          <w:b/>
-          <w:bCs/>
-          <w:color w:val="1A3C5E"/>
-          <w:sz w:val="32"/>
-          <w:szCs w:val="32"/>
-        </w:rPr>
-        <w:t>OPERATIONS &amp; CONTROL LAYER (MANDATORY)</w:t>
+        <w:t>44. Advanced Operations &amp; Control Layer (Mandatory)</w:t>
       </w:r>
     </w:p>
     <w:p>
@@ -22311,6 +22424,46 @@
       </w:pPr>
       <w:r>
         <w:t>Structured error responses</w:t>
+      </w:r>
+    </w:p>
+    <w:p>
+      <w:pPr>
+        <w:pStyle w:val="Heading3"/>
+      </w:pPr>
+      <w:r>
+        <w:t>Execution Rules:</w:t>
+      </w:r>
+    </w:p>
+    <w:p>
+      <w:pPr>
+        <w:pStyle w:val="ListParagraph"/>
+      </w:pPr>
+      <w:r>
+        <w:t>Every API must define the caller role, validation rules, success response, error response, audit event, and retry or reconciliation behavior where applicable</w:t>
+      </w:r>
+    </w:p>
+    <w:p>
+      <w:pPr>
+        <w:pStyle w:val="ListParagraph"/>
+      </w:pPr>
+      <w:r>
+        <w:t>Create and update endpoints must support idempotency protection for duplicate requests on critical flows such as booking, payment, refund, and scan ingestion</w:t>
+      </w:r>
+    </w:p>
+    <w:p>
+      <w:pPr>
+        <w:pStyle w:val="ListParagraph"/>
+      </w:pPr>
+      <w:r>
+        <w:t>List endpoints must define pagination, filtering, sorting, and data visibility rules by role</w:t>
+      </w:r>
+    </w:p>
+    <w:p>
+      <w:pPr>
+        <w:pStyle w:val="ListParagraph"/>
+      </w:pPr>
+      <w:r>
+        <w:t>Breaking contract changes require versioning or an explicit migration plan</w:t>
       </w:r>
     </w:p>
     <w:p>
@@ -23111,34 +23264,565 @@
     </w:p>
     <w:p>
       <w:pPr>
-        <w:spacing w:after="80"/>
-      </w:pPr>
-    </w:p>
-    <w:p>
-      <w:pPr>
-        <w:spacing w:after="80"/>
-      </w:pPr>
-    </w:p>
-    <w:p>
-      <w:pPr>
-        <w:spacing w:after="80"/>
-      </w:pPr>
-    </w:p>
-    <w:p>
-      <w:pPr>
+        <w:pStyle w:val="Heading1"/>
+      </w:pPr>
+      <w:r>
+        <w:t>51. Release Phasing &amp; MVP Definition</w:t>
+      </w:r>
+    </w:p>
+    <w:p>
+      <w:pPr>
+        <w:pStyle w:val="Heading3"/>
+      </w:pPr>
+      <w:r>
+        <w:t>Phase 0 - Platform Foundation</w:t>
+      </w:r>
+    </w:p>
+    <w:p>
+      <w:pPr>
+        <w:pStyle w:val="ListParagraph"/>
+      </w:pPr>
+      <w:r>
+        <w:t>Authentication, RBAC, agency master data, audit logging, configuration controls, observability, and infrastructure readiness</w:t>
+      </w:r>
+    </w:p>
+    <w:p>
+      <w:pPr>
+        <w:pStyle w:val="Heading3"/>
+      </w:pPr>
+      <w:r>
+        <w:t>Phase 1 - Core Transport Launch</w:t>
+      </w:r>
+    </w:p>
+    <w:p>
+      <w:pPr>
+        <w:pStyle w:val="ListParagraph"/>
+      </w:pPr>
+      <w:r>
+        <w:t>Customer booking, admin or dispatch operations, driver mobile flows, fleet and compliance basics, real-time tracking, base payment collection, notifications, and operational reporting</w:t>
+      </w:r>
+    </w:p>
+    <w:p>
+      <w:pPr>
+        <w:pStyle w:val="Heading3"/>
+      </w:pPr>
+      <w:r>
+        <w:t>Phase 2 - Warehouse &amp; Commerce Expansion</w:t>
+      </w:r>
+    </w:p>
+    <w:p>
+      <w:pPr>
+        <w:pStyle w:val="ListParagraph"/>
+      </w:pPr>
+      <w:r>
+        <w:t>Warehouse operations, inventory, barcode and scan enforcement, LR and waybill, invoicing, contracts, multi-service billing, and SLA automation</w:t>
+      </w:r>
+    </w:p>
+    <w:p>
+      <w:pPr>
+        <w:pStyle w:val="Heading3"/>
+      </w:pPr>
+      <w:r>
+        <w:t>Phase 3 - Advanced Optimization &amp; Control</w:t>
+      </w:r>
+    </w:p>
+    <w:p>
+      <w:pPr>
+        <w:pStyle w:val="ListParagraph"/>
+      </w:pPr>
+      <w:r>
+        <w:t>Fraud detection, fuel and payroll engines, breakdown rescue, capacity planning, marketplace mode, demand heatmaps, retention systems, and advanced analytics</w:t>
+      </w:r>
+    </w:p>
+    <w:p>
+      <w:pPr>
+        <w:pStyle w:val="Heading3"/>
+      </w:pPr>
+      <w:r>
+        <w:t>Rule:</w:t>
+      </w:r>
+    </w:p>
+    <w:p>
+      <w:pPr>
+        <w:pStyle w:val="ListParagraph"/>
+      </w:pPr>
+      <w:r>
+        <w:t>Only features inside the approved phase are considered launch scope; all other items must be tracked as deferred scope with an explicit target release</w:t>
+      </w:r>
+    </w:p>
+    <w:p>
+      <w:pPr>
+        <w:pStyle w:val="Heading1"/>
+      </w:pPr>
+      <w:r>
+        <w:t>52. Acceptance Criteria &amp; Definition of Done</w:t>
+      </w:r>
+    </w:p>
+    <w:p>
+      <w:pPr>
+        <w:pStyle w:val="Heading3"/>
+      </w:pPr>
+      <w:r>
+        <w:t>Every requirement is complete only when:</w:t>
+      </w:r>
+    </w:p>
+    <w:p>
+      <w:pPr>
+        <w:pStyle w:val="ListParagraph"/>
+      </w:pPr>
+      <w:r>
+        <w:t>Business rule, exceptions, and approval path are documented and approved</w:t>
+      </w:r>
+    </w:p>
+    <w:p>
+      <w:pPr>
+        <w:pStyle w:val="ListParagraph"/>
+      </w:pPr>
+      <w:r>
+        <w:t>API contract, UI flow, data fields, validations, and role permissions are defined</w:t>
+      </w:r>
+    </w:p>
+    <w:p>
+      <w:pPr>
+        <w:pStyle w:val="ListParagraph"/>
+      </w:pPr>
+      <w:r>
+        <w:t>Audit events, notifications, reports, and reconciliation behavior are specified where applicable</w:t>
+      </w:r>
+    </w:p>
+    <w:p>
+      <w:pPr>
+        <w:pStyle w:val="ListParagraph"/>
+      </w:pPr>
+      <w:r>
+        <w:t>Happy path, unhappy path, retry path, and permission-denied path are tested</w:t>
+      </w:r>
+    </w:p>
+    <w:p>
+      <w:pPr>
+        <w:pStyle w:val="ListParagraph"/>
+      </w:pPr>
+      <w:r>
+        <w:t>Support playbooks and operational fallback steps are available for launch-critical flows</w:t>
+      </w:r>
+    </w:p>
+    <w:p>
+      <w:pPr>
+        <w:pStyle w:val="Heading1"/>
+      </w:pPr>
+      <w:r>
+        <w:t>53. Non-Functional Requirements &amp; Service Levels</w:t>
+      </w:r>
+    </w:p>
+    <w:p>
+      <w:pPr>
+        <w:pStyle w:val="Heading3"/>
+      </w:pPr>
+      <w:r>
+        <w:t>Performance Targets</w:t>
+      </w:r>
+    </w:p>
+    <w:p>
+      <w:pPr>
+        <w:pStyle w:val="ListParagraph"/>
+      </w:pPr>
+      <w:r>
+        <w:t>Auth, booking, and payment APIs should meet p95 response times of 2 seconds or better under normal operating load</w:t>
+      </w:r>
+    </w:p>
+    <w:p>
+      <w:pPr>
+        <w:pStyle w:val="ListParagraph"/>
+      </w:pPr>
+      <w:r>
+        <w:t>Search, reporting, and list APIs should meet p95 response times of 5 seconds or better under normal operating load</w:t>
+      </w:r>
+    </w:p>
+    <w:p>
+      <w:pPr>
+        <w:pStyle w:val="ListParagraph"/>
+      </w:pPr>
+      <w:r>
+        <w:t>Real-time tracking and event propagation should be visible to operational dashboards within 10 seconds under normal network conditions</w:t>
+      </w:r>
+    </w:p>
+    <w:p>
+      <w:pPr>
+        <w:pStyle w:val="ListParagraph"/>
+      </w:pPr>
+      <w:r>
+        <w:t>Offline scans and queued location updates should sync within 60 seconds of reconnect where network is restored</w:t>
+      </w:r>
+    </w:p>
+    <w:p>
+      <w:pPr>
+        <w:pStyle w:val="Heading3"/>
+      </w:pPr>
+      <w:r>
+        <w:t>Reliability &amp; Control</w:t>
+      </w:r>
+    </w:p>
+    <w:p>
+      <w:pPr>
+        <w:pStyle w:val="ListParagraph"/>
+      </w:pPr>
+      <w:r>
+        <w:t>Availability target: 99.9 percent or higher for launch-critical services</w:t>
+      </w:r>
+    </w:p>
+    <w:p>
+      <w:pPr>
+        <w:pStyle w:val="ListParagraph"/>
+      </w:pPr>
+      <w:r>
+        <w:t>Backup and disaster recovery target remains RTO 4 hours and RPO 1 hour</w:t>
+      </w:r>
+    </w:p>
+    <w:p>
+      <w:pPr>
+        <w:pStyle w:val="ListParagraph"/>
+      </w:pPr>
+      <w:r>
+        <w:t>Critical alerts should be generated within 1 minute of the triggering event</w:t>
+      </w:r>
+    </w:p>
+    <w:p>
+      <w:pPr>
+        <w:pStyle w:val="ListParagraph"/>
+      </w:pPr>
+      <w:r>
+        <w:t>Audit records for financial and high-risk administrative actions must be immutable after lock or approval</w:t>
+      </w:r>
+    </w:p>
+    <w:p>
+      <w:pPr>
+        <w:pStyle w:val="Heading1"/>
+      </w:pPr>
+      <w:r>
+        <w:t>54. Dependencies, Assumptions &amp; Fallback Modes</w:t>
+      </w:r>
+    </w:p>
+    <w:p>
+      <w:pPr>
+        <w:pStyle w:val="Heading3"/>
+      </w:pPr>
+      <w:r>
+        <w:t>External Dependencies</w:t>
+      </w:r>
+    </w:p>
+    <w:p>
+      <w:pPr>
+        <w:pStyle w:val="ListParagraph"/>
+      </w:pPr>
+      <w:r>
+        <w:t>Payment gateways or banking partners for collection, settlement, refund, and payout flows</w:t>
+      </w:r>
+    </w:p>
+    <w:p>
+      <w:pPr>
+        <w:pStyle w:val="ListParagraph"/>
+      </w:pPr>
+      <w:r>
+        <w:t>Map, geocoding, routing, and ETA providers for address validation and trip calculation</w:t>
+      </w:r>
+    </w:p>
+    <w:p>
+      <w:pPr>
+        <w:pStyle w:val="ListParagraph"/>
+      </w:pPr>
+      <w:r>
+        <w:t>SMS, email, push, and WhatsApp providers for notification delivery</w:t>
+      </w:r>
+    </w:p>
+    <w:p>
+      <w:pPr>
+        <w:pStyle w:val="ListParagraph"/>
+      </w:pPr>
+      <w:r>
+        <w:t>GPS hardware or telematics providers where vehicle-level tracking is required</w:t>
+      </w:r>
+    </w:p>
+    <w:p>
+      <w:pPr>
+        <w:pStyle w:val="ListParagraph"/>
+      </w:pPr>
+      <w:r>
+        <w:t>Object storage, queue or cache services, and monitoring stack for platform operations</w:t>
+      </w:r>
+    </w:p>
+    <w:p>
+      <w:pPr>
+        <w:pStyle w:val="Heading3"/>
+      </w:pPr>
+      <w:r>
+        <w:t>Fallback Rules</w:t>
+      </w:r>
+    </w:p>
+    <w:p>
+      <w:pPr>
+        <w:pStyle w:val="ListParagraph"/>
+      </w:pPr>
+      <w:r>
+        <w:t>Payment provider failure must move the transaction to payment_pending or manual review and must never create a false success state</w:t>
+      </w:r>
+    </w:p>
+    <w:p>
+      <w:pPr>
+        <w:pStyle w:val="ListParagraph"/>
+      </w:pPr>
+      <w:r>
+        <w:t>Map or routing degradation must still allow lat/lng capture with operations-controlled manual dispatch fallback</w:t>
+      </w:r>
+    </w:p>
+    <w:p>
+      <w:pPr>
+        <w:pStyle w:val="ListParagraph"/>
+      </w:pPr>
+      <w:r>
+        <w:t>Messaging failure must trigger next-channel retry plus an admin-visible delivery alert</w:t>
+      </w:r>
+    </w:p>
+    <w:p>
+      <w:pPr>
+        <w:pStyle w:val="ListParagraph"/>
+      </w:pPr>
+      <w:r>
+        <w:t>GPS hardware failure may fall back to mobile GPS but must mark the trip with reduced tracking confidence</w:t>
+      </w:r>
+    </w:p>
+    <w:p>
+      <w:pPr>
+        <w:pStyle w:val="ListParagraph"/>
+      </w:pPr>
+      <w:r>
+        <w:t>All external dependency failures must create a visible ops event with retry or manual resolution workflow</w:t>
+      </w:r>
+    </w:p>
+    <w:p>
+      <w:pPr>
+        <w:pStyle w:val="Heading1"/>
+      </w:pPr>
+      <w:r>
+        <w:t>55. Testing, UAT &amp; Sign-Off</w:t>
+      </w:r>
+    </w:p>
+    <w:p>
+      <w:pPr>
+        <w:pStyle w:val="Heading3"/>
+      </w:pPr>
+      <w:r>
+        <w:t>Mandatory Test Layers</w:t>
+      </w:r>
+    </w:p>
+    <w:p>
+      <w:pPr>
+        <w:pStyle w:val="ListParagraph"/>
+      </w:pPr>
+      <w:r>
+        <w:t>Unit, integration, end-to-end, role and permission, finance reconciliation, offline sync, security, performance, backup restore, and disaster recovery drills</w:t>
+      </w:r>
+    </w:p>
+    <w:p>
+      <w:pPr>
+        <w:pStyle w:val="Heading3"/>
+      </w:pPr>
+      <w:r>
+        <w:t>Business Sign-Off Owners</w:t>
+      </w:r>
+    </w:p>
+    <w:p>
+      <w:pPr>
+        <w:pStyle w:val="ListParagraph"/>
+      </w:pPr>
+      <w:r>
+        <w:t>Product or operations sign-off for workflow correctness and exception handling</w:t>
+      </w:r>
+    </w:p>
+    <w:p>
+      <w:pPr>
+        <w:pStyle w:val="ListParagraph"/>
+      </w:pPr>
+      <w:r>
+        <w:t>Finance sign-off for payment, wallet, invoice, refund, payout, and reconciliation flows</w:t>
+      </w:r>
+    </w:p>
+    <w:p>
+      <w:pPr>
+        <w:pStyle w:val="ListParagraph"/>
+      </w:pPr>
+      <w:r>
+        <w:t>Support sign-off for ticketing, escalation, and customer care workflows</w:t>
+      </w:r>
+    </w:p>
+    <w:p>
+      <w:pPr>
+        <w:pStyle w:val="ListParagraph"/>
+      </w:pPr>
+      <w:r>
+        <w:t>Security or compliance sign-off for authentication, audit, privacy, and access control</w:t>
+      </w:r>
+    </w:p>
+    <w:p>
+      <w:pPr>
+        <w:pStyle w:val="ListParagraph"/>
+      </w:pPr>
+      <w:r>
+        <w:t>Technology sign-off for APIs, data integrity, monitoring, rollback, and infrastructure readiness</w:t>
+      </w:r>
+    </w:p>
+    <w:p>
+      <w:pPr>
+        <w:pStyle w:val="Heading3"/>
+      </w:pPr>
+      <w:r>
+        <w:t>Release Rule</w:t>
+      </w:r>
+    </w:p>
+    <w:p>
+      <w:pPr>
+        <w:pStyle w:val="ListParagraph"/>
+      </w:pPr>
+      <w:r>
+        <w:t>No launch-critical module may go live without written UAT sign-off and tracked closure of all critical defects</w:t>
+      </w:r>
+    </w:p>
+    <w:p>
+      <w:pPr>
+        <w:pStyle w:val="Heading1"/>
+      </w:pPr>
+      <w:r>
+        <w:t>56. Requirement Traceability &amp; Change Control</w:t>
+      </w:r>
+    </w:p>
+    <w:p>
+      <w:pPr>
+        <w:pStyle w:val="Heading3"/>
+      </w:pPr>
+      <w:r>
+        <w:t>Traceability Minimum Fields</w:t>
+      </w:r>
+    </w:p>
+    <w:p>
+      <w:pPr>
+        <w:pStyle w:val="ListParagraph"/>
+      </w:pPr>
+      <w:r>
+        <w:t>Every requirement must map to a requirement ID, module, owner, priority, release phase, API or UI reference, data model reference, test case IDs, and current status</w:t>
+      </w:r>
+    </w:p>
+    <w:p>
+      <w:pPr>
+        <w:pStyle w:val="Heading3"/>
+      </w:pPr>
+      <w:r>
+        <w:t>Change Control Rules</w:t>
+      </w:r>
+    </w:p>
+    <w:p>
+      <w:pPr>
+        <w:pStyle w:val="ListParagraph"/>
+      </w:pPr>
+      <w:r>
+        <w:t>Rate card, SLA, permission, payout, and financial rule changes must be versioned with approver, timestamp, previous value, and new value</w:t>
+      </w:r>
+    </w:p>
+    <w:p>
+      <w:pPr>
+        <w:pStyle w:val="ListParagraph"/>
+      </w:pPr>
+      <w:r>
+        <w:t>Breaking changes after design sign-off require a migration plan and explicit approval</w:t>
+      </w:r>
+    </w:p>
+    <w:p>
+      <w:pPr>
+        <w:pStyle w:val="ListParagraph"/>
+      </w:pPr>
+      <w:r>
+        <w:t>Scope added after UAT freeze must be treated as a formal change request and not silently merged into the release scope</w:t>
+      </w:r>
+    </w:p>
+    <w:p>
+      <w:pPr>
+        <w:pStyle w:val="Heading1"/>
+      </w:pPr>
+      <w:r>
+        <w:t>57. Go-Live Exit Criteria</w:t>
+      </w:r>
+    </w:p>
+    <w:p>
+      <w:pPr>
+        <w:pStyle w:val="Heading3"/>
+      </w:pPr>
+      <w:r>
+        <w:t>Launch cannot proceed until:</w:t>
+      </w:r>
+    </w:p>
+    <w:p>
+      <w:pPr>
+        <w:pStyle w:val="ListParagraph"/>
+      </w:pPr>
+      <w:r>
+        <w:t>All Phase 1 mandatory flows pass UAT from booking creation through operational completion and payment closure</w:t>
+      </w:r>
+    </w:p>
+    <w:p>
+      <w:pPr>
+        <w:pStyle w:val="ListParagraph"/>
+      </w:pPr>
+      <w:r>
+        <w:t>There are no open critical defects in launch scope</w:t>
+      </w:r>
+    </w:p>
+    <w:p>
+      <w:pPr>
+        <w:pStyle w:val="ListParagraph"/>
+      </w:pPr>
+      <w:r>
+        <w:t>Monitoring, alerting, reconciliation, and audit logging are verified in the target environment</w:t>
+      </w:r>
+    </w:p>
+    <w:p>
+      <w:pPr>
+        <w:pStyle w:val="ListParagraph"/>
+      </w:pPr>
+      <w:r>
+        <w:t>Provider credentials, templates, rate cards, user roles, and permissions are configured and approved</w:t>
+      </w:r>
+    </w:p>
+    <w:p>
+      <w:pPr>
+        <w:pStyle w:val="ListParagraph"/>
+      </w:pPr>
+      <w:r>
+        <w:t>Support escalation roster, SOPs, and rollback runbooks are active</w:t>
+      </w:r>
+    </w:p>
+    <w:p>
+      <w:pPr>
+        <w:pStyle w:val="ListParagraph"/>
+      </w:pPr>
+      <w:r>
+        <w:t>Backup restore and rollback drills are completed successfully</w:t>
+      </w:r>
+    </w:p>
+    <w:p>
+      <w:pPr>
+        <w:pStyle w:val="ListParagraph"/>
+      </w:pPr>
+      <w:r>
+        <w:t>A pilot or controlled live validation is completed and reviewed by operations leadership</w:t>
+      </w:r>
+    </w:p>
+    <w:p>
+      <w:pPr>
+        <w:pStyle w:val="Heading1"/>
         <w:shd w:val="clear" w:color="auto" w:fill="1A3C5E"/>
         <w:spacing w:after="120"/>
         <w:jc w:val="center"/>
       </w:pPr>
       <w:r>
-        <w:rPr>
-          <w:b/>
-          <w:bCs/>
-          <w:color w:val="FFFFFF"/>
-          <w:sz w:val="28"/>
-          <w:szCs w:val="28"/>
-        </w:rPr>
-        <w:t>FINAL VERDICT</w:t>
+        <w:t>Final Verdict</w:t>
       </w:r>
     </w:p>
     <w:p>

</xml_diff>

<commit_message>
Finalize owned-fleet and courier-company expansion
</commit_message>
<xml_diff>
--- a/docs/prd/ZITO_PRD_v10_ULTIMATE.docx
+++ b/docs/prd/ZITO_PRD_v10_ULTIMATE.docx
@@ -23881,6 +23881,52 @@
         <w:t xml:space="preserve">  Production-Ready</w:t>
       </w:r>
     </w:p>
+    <w:p/>
+    <w:p>
+      <w:r>
+        <w:t>58. Courier Company &amp; Owned Fleet Expansion Addendum</w:t>
+      </w:r>
+    </w:p>
+    <w:p>
+      <w:r>
+        <w:t>Objective: Extend Zito beyond standard customer and transporter usage by enabling customer-owned fleets, dedicated courier-company operations, and platform-managed PTL supply-chain orchestration.</w:t>
+      </w:r>
+    </w:p>
+    <w:p>
+      <w:r>
+        <w:t>Role Model: Add a dedicated COURIER_COMPANY role with separate login and portal routing. Courier companies operate as demand-side partners that can create PTL and courier requests, manage their own fleet, and hire platform capacity when internal supply is insufficient.</w:t>
+      </w:r>
+    </w:p>
+    <w:p>
+      <w:r>
+        <w:t>Owned Fleet Scope: Customer, Corporate, Courier Company, and Transporter accounts may register and manage vehicles they own under their own account scope, with ownership-based access control enforced across fleet workflows.</w:t>
+      </w:r>
+    </w:p>
+    <w:p>
+      <w:r>
+        <w:t>Commercial Model: The platform must support platform-fee charging per owned vehicle, per managed fleet, or per transaction depending on commercial agreement. Fee policy may be contract-driven, subscription-driven, or usage-driven.</w:t>
+      </w:r>
+    </w:p>
+    <w:p>
+      <w:r>
+        <w:t>Courier Supply Chain Mode: Courier companies may request PTL, courier, or FTL capacity from the Zito platform. The platform should match owned-fleet preference first when configured, then fall back to transporter or marketplace supply under the same booking and tracking chain.</w:t>
+      </w:r>
+    </w:p>
+    <w:p>
+      <w:r>
+        <w:t>Multi-Load / Multi-Unload Rules: Courier-company requests must support multiple loading points and multiple unloading points. Booking validation must require at least one load or pickup stop and at least one unload or delivery stop, while preserving ordered stop sequencing for routing, scanning, and handoff visibility.</w:t>
+      </w:r>
+    </w:p>
+    <w:p>
+      <w:r>
+        <w:t>Operations &amp; Traceability: Every parcel or shipment movement under courier-company mode must remain linked to vehicle, driver, booking, scan, waybill or LR, and destination chain-of-custody records exactly like the base logistics flow.</w:t>
+      </w:r>
+    </w:p>
+    <w:p>
+      <w:r>
+        <w:t>Implementation Guidance: The app should expose separate courier-company web and mobile workspaces, customer-owned fleet management, and future finance automation for platform-fee billing. Where billing automation is not yet live, the PRD must mark it as a pending finance-control follow-up rather than implying completion.</w:t>
+      </w:r>
+    </w:p>
     <w:sectPr>
       <w:headerReference w:type="default" r:id="rId7"/>
       <w:footerReference w:type="default" r:id="rId8"/>

</xml_diff>

<commit_message>
Update Neon deployment and related docs/config
</commit_message>
<xml_diff>
--- a/docs/prd/ZITO_PRD_v10_ULTIMATE.docx
+++ b/docs/prd/ZITO_PRD_v10_ULTIMATE.docx
@@ -10942,6 +10942,14 @@
           <w:color w:val="1A1A2E"/>
         </w:rPr>
         <w:t>Point-in-time recovery (PITR) for PostgreSQL</w:t>
+      </w:r>
+    </w:p>
+    <w:p>
+      <w:pPr>
+        <w:pStyle w:val="ListParagraph"/>
+      </w:pPr>
+      <w:r>
+        <w:t>Managed database baseline: Neon PostgreSQL</w:t>
       </w:r>
     </w:p>
     <w:p>
@@ -22705,6 +22713,14 @@
     <w:p>
       <w:pPr>
         <w:pStyle w:val="ListParagraph"/>
+      </w:pPr>
+      <w:r>
+        <w:t>Database baseline: Neon PostgreSQL</w:t>
+      </w:r>
+    </w:p>
+    <w:p>
+      <w:pPr>
+        <w:pStyle w:val="ListParagraph"/>
         <w:numPr>
           <w:ilvl w:val="0"/>
           <w:numId w:val="119"/>
@@ -22766,6 +22782,14 @@
       </w:pPr>
       <w:r>
         <w:t>Failover and redundancy systems</w:t>
+      </w:r>
+    </w:p>
+    <w:p>
+      <w:pPr>
+        <w:pStyle w:val="ListParagraph"/>
+      </w:pPr>
+      <w:r>
+        <w:t>Application hosting and Redis must remain provider-agnostic and must not be coupled to a single infrastructure vendor in the PRD.</w:t>
       </w:r>
     </w:p>
     <w:p>
@@ -23548,6 +23572,14 @@
       </w:pPr>
       <w:r>
         <w:t>Object storage, queue or cache services, and monitoring stack for platform operations</w:t>
+      </w:r>
+    </w:p>
+    <w:p>
+      <w:pPr>
+        <w:pStyle w:val="ListParagraph"/>
+      </w:pPr>
+      <w:r>
+        <w:t>Neon PostgreSQL as the managed transactional database provider</w:t>
       </w:r>
     </w:p>
     <w:p>

</xml_diff>